<commit_message>
Added LODES techdoc to data directory
</commit_message>
<xml_diff>
--- a/Notes/Project_Steps_20220527.docx
+++ b/Notes/Project_Steps_20220527.docx
@@ -31,19 +31,17 @@
         </w:numPr>
       </w:pPr>
       <w:r>
-        <w:t>Introduction to project. Download data for California. Set up software: R</w:t>
-      </w:r>
-      <w:r>
-        <w:t>/Stata</w:t>
-      </w:r>
-      <w:r>
-        <w:t xml:space="preserve">, </w:t>
-      </w:r>
-      <w:proofErr w:type="spellStart"/>
-      <w:r>
-        <w:t>Github</w:t>
-      </w:r>
-      <w:proofErr w:type="spellEnd"/>
+        <w:t xml:space="preserve">Introduction to project. Download data for California. Set up software: </w:t>
+      </w:r>
+      <w:r>
+        <w:t>Stata</w:t>
+      </w:r>
+      <w:r>
+        <w:t>, Github</w:t>
+      </w:r>
+      <w:r>
+        <w:t>, Zotero</w:t>
+      </w:r>
     </w:p>
     <w:p>
       <w:pPr>
@@ -102,7 +100,10 @@
         </w:numPr>
       </w:pPr>
       <w:r>
-        <w:t>Identify census block code for relevant communities, add them as flags to datasets</w:t>
+        <w:t xml:space="preserve">Identify census block code for relevant communities, </w:t>
+      </w:r>
+      <w:r>
+        <w:t>create data extracts with just those geocodes</w:t>
       </w:r>
     </w:p>
     <w:p>
@@ -165,13 +166,8 @@
         </w:numPr>
       </w:pPr>
       <w:r>
-        <w:t xml:space="preserve">For jobs with both Paradise as both home and work </w:t>
-      </w:r>
-      <w:proofErr w:type="gramStart"/>
-      <w:r>
-        <w:t>geocodes</w:t>
-      </w:r>
-      <w:proofErr w:type="gramEnd"/>
+        <w:t>For jobs with both Paradise as both home and work geocodes</w:t>
+      </w:r>
     </w:p>
     <w:p>
       <w:pPr>

</xml_diff>